<commit_message>
Add VLDB 2026 Distinguished Associate Editor to Honors
Announced by the PVLDB Vol. 19 EiCs / VLDB 2026 PC Chairs on
August 29, 2026; recognized at the VLDB 2026 opening session.

Synced across all three CV sources per CLAUDE.md: _pages/about.md,
resume/cv-short.docx, resume/cv-full.docx.

Co-Authored-By: Claude Opus 5 (1M context) <noreply@anthropic.com>
Claude-Session: https://claude.ai/code/session_014bn1uASPVQE1wdcjt5pRpp
</commit_message>
<xml_diff>
--- a/resume/cv-full.docx
+++ b/resume/cv-full.docx
@@ -2091,6 +2091,20 @@
         </w:rPr>
         <w:lastRenderedPageBreak/>
         <w:t>Honors</w:t>
+      </w:r>
+    </w:p>
+    <w:p>
+      <w:pPr>
+        <w:ind w:leftChars="180" w:left="1260" w:hangingChars="450" w:hanging="900"/>
+        <w:rPr>
+          <w:rFonts w:ascii="Times New Roman"/>
+        </w:rPr>
+      </w:pPr>
+      <w:r>
+        <w:rPr>
+          <w:rFonts w:ascii="Times New Roman" w:hint="eastAsia"/>
+        </w:rPr>
+        <w:t>VLDB 2026 Distinguished Associate Editor, 2026</w:t>
       </w:r>
     </w:p>
     <w:p>

</xml_diff>

<commit_message>
Add two NeurIPS 2026 papers (Hi-Q, AutoSaddler) to cv-full
Co-Authored-By: Claude Opus 5.5 (1M context) <noreply@anthropic.com>
</commit_message>
<xml_diff>
--- a/resume/cv-full.docx
+++ b/resume/cv-full.docx
@@ -15,7 +15,7 @@
         <w:rPr>
           <w:rFonts w:ascii="Times New Roman" w:hint="eastAsia"/>
         </w:rPr>
-        <w:t>September 14, 2026</w:t>
+        <w:t>September 25, 2026</w:t>
       </w:r>
     </w:p>
     <w:p>
@@ -8863,6 +8863,92 @@
           <w:rFonts w:ascii="Times New Roman"/>
         </w:rPr>
         <w:t xml:space="preserve">, ACM SIGMOD, Huntington Beach, CA, USA, June 2027. (corresponding author)</w:t>
+      </w:r>
+    </w:p>
+    <w:p>
+      <w:pPr>
+        <w:numPr>
+          <w:ilvl w:val="0"/>
+          <w:numId w:val="3"/>
+        </w:numPr>
+        <w:rPr>
+          <w:rFonts w:ascii="Times New Roman"/>
+        </w:rPr>
+      </w:pPr>
+      <w:r>
+        <w:rPr>
+          <w:rFonts w:ascii="Times New Roman"/>
+        </w:rPr>
+        <w:t xml:space="preserve">Kim, J., Park, S., and </w:t>
+      </w:r>
+      <w:r>
+        <w:rPr>
+          <w:rFonts w:ascii="Times New Roman"/>
+          <w:u w:val="single"/>
+        </w:rPr>
+        <w:t>Han, W.</w:t>
+      </w:r>
+      <w:r>
+        <w:rPr>
+          <w:rFonts w:ascii="Times New Roman"/>
+        </w:rPr>
+        <w:t xml:space="preserve">, “Hi-Q: Hierarchical Evidence-guided Query Refinement for Multi-Hop Question Answering,” In </w:t>
+      </w:r>
+      <w:r>
+        <w:rPr>
+          <w:rFonts w:ascii="Times New Roman"/>
+          <w:i/>
+        </w:rPr>
+        <w:t>Proc., 40th Annual Conference on Neural Information Processing Systems,</w:t>
+      </w:r>
+      <w:r>
+        <w:rPr>
+          <w:rFonts w:ascii="Times New Roman"/>
+        </w:rPr>
+        <w:t xml:space="preserve"> NeurIPS, Sydney, Australia, December 2026. (corresponding author)</w:t>
+      </w:r>
+    </w:p>
+    <w:p>
+      <w:pPr>
+        <w:numPr>
+          <w:ilvl w:val="0"/>
+          <w:numId w:val="3"/>
+        </w:numPr>
+        <w:rPr>
+          <w:rFonts w:ascii="Times New Roman"/>
+        </w:rPr>
+      </w:pPr>
+      <w:r>
+        <w:rPr>
+          <w:rFonts w:ascii="Times New Roman"/>
+        </w:rPr>
+        <w:t xml:space="preserve">Park, S., Kim, W., Tan, R., Zhang, J., </w:t>
+      </w:r>
+      <w:r>
+        <w:rPr>
+          <w:rFonts w:ascii="Times New Roman"/>
+          <w:u w:val="single"/>
+        </w:rPr>
+        <w:t>Han, W.</w:t>
+      </w:r>
+      <w:r>
+        <w:rPr>
+          <w:rFonts w:ascii="Times New Roman"/>
+        </w:rPr>
+        <w:t xml:space="preserve">, Gao, P., Park, C., Lin, Q., Rajmohan, S., and Zhang, D., “AutoSaddler: Automatic Harness Optimization with Durable Updates from Agent Execution Traces,” In </w:t>
+      </w:r>
+      <w:r>
+        <w:rPr>
+          <w:rFonts w:ascii="Times New Roman"/>
+          <w:i/>
+        </w:rPr>
+        <w:t>Proc., 40th Annual Conference on Neural Information Processing Systems,</w:t>
+      </w:r>
+      <w:r>
+        <w:rPr>
+          <w:rFonts w:ascii="Times New Roman"/>
+        </w:rPr>
+        <w:t xml:space="preserve"> NeurIPS, Sydney, Australia, December 2026. (co-corresponding author)</w:t>
       </w:r>
     </w:p>
     <w:p>

</xml_diff>

<commit_message>
Fix keynote title: Evolution of Graph Intelligence (about.md, cv-full)
Co-Authored-By: Claude Opus 5.5 (1M context) <noreply@anthropic.com>
</commit_message>
<xml_diff>
--- a/resume/cv-full.docx
+++ b/resume/cv-full.docx
@@ -20628,7 +20628,7 @@
           <w:rFonts w:ascii="Times New Roman" w:eastAsia="함초롬바탕" w:hAnsi="Times New Roman" w:cs="Times New Roman"/>
           <w:shd w:val="clear" w:color="auto" w:fill="FFFFFF"/>
         </w:rPr>
-        <w:t xml:space="preserve">he Long Journey from Subgraphs to Autonomous Agents: Evaluation of Graph Intelligence, </w:t>
+        <w:t xml:space="preserve">he Long Journey from Subgraphs to Autonomous Agents: Evolution of Graph Intelligence, </w:t>
       </w:r>
       <w:r>
         <w:rPr>
@@ -20677,7 +20677,7 @@
           <w:rFonts w:ascii="Times New Roman" w:eastAsia="함초롬바탕" w:hAnsi="Times New Roman" w:cs="Times New Roman"/>
           <w:shd w:val="clear" w:color="auto" w:fill="FFFFFF"/>
         </w:rPr>
-        <w:t xml:space="preserve">he Long Journey from Subgraphs to Autonomous Agents: Evaluation of Graph Intelligence, </w:t>
+        <w:t xml:space="preserve">he Long Journey from Subgraphs to Autonomous Agents: Evolution of Graph Intelligence, </w:t>
       </w:r>
       <w:r>
         <w:rPr>

</xml_diff>

<commit_message>
Add ACL 2025, EMNLP 2025, NeurIPS 2026, ICML 2026 reviewer entries to cv-full
Co-Authored-By: Claude Opus 5.5 <noreply@anthropic.com>
</commit_message>
<xml_diff>
--- a/resume/cv-full.docx
+++ b/resume/cv-full.docx
@@ -15,7 +15,7 @@
         <w:rPr>
           <w:rFonts w:ascii="Times New Roman" w:hint="eastAsia"/>
         </w:rPr>
-        <w:t>September 25, 2026</w:t>
+        <w:t>September 29, 2026</w:t>
       </w:r>
     </w:p>
     <w:p>
@@ -4864,9 +4864,53 @@
       </w:pPr>
       <w:r>
         <w:rPr>
-          <w:rFonts w:ascii="Times New Roman" w:hint="eastAsia"/>
+          <w:rFonts w:ascii="Times New Roman"/>
           <w:color w:val="000000"/>
         </w:rPr>
+        <w:t>Reviewer, the 40th Annual Conference on Neural Information Processing Systems (NeurIPS), Sydney, Australia, December 2026</w:t>
+      </w:r>
+    </w:p>
+    <w:p>
+      <w:pPr>
+        <w:numPr>
+          <w:ilvl w:val="0"/>
+          <w:numId w:val="1"/>
+        </w:numPr>
+        <w:tabs>
+          <w:tab w:val="left" w:pos="1440"/>
+        </w:tabs>
+        <w:rPr>
+          <w:rFonts w:ascii="Times New Roman"/>
+          <w:color w:val="000000"/>
+        </w:rPr>
+      </w:pPr>
+      <w:r>
+        <w:rPr>
+          <w:rFonts w:ascii="Times New Roman"/>
+          <w:color w:val="000000"/>
+        </w:rPr>
+        <w:t>Reviewer, the 43rd International Conference on Machine Learning (ICML), Seoul, Korea, July 2026</w:t>
+      </w:r>
+    </w:p>
+    <w:p>
+      <w:pPr>
+        <w:numPr>
+          <w:ilvl w:val="0"/>
+          <w:numId w:val="1"/>
+        </w:numPr>
+        <w:tabs>
+          <w:tab w:val="left" w:pos="1440"/>
+        </w:tabs>
+        <w:rPr>
+          <w:rFonts w:ascii="Times New Roman"/>
+          <w:color w:val="000000"/>
+        </w:rPr>
+      </w:pPr>
+      <w:r>
+        <w:rPr>
+          <w:rFonts w:ascii="Times New Roman" w:hint="eastAsia"/>
+          <w:color w:val="000000"/>
+        </w:rPr>
         <w:t xml:space="preserve">Program Committee Member, the </w:t>
       </w:r>
       <w:r>
@@ -4968,7 +5012,51 @@
           <w:rFonts w:ascii="Times New Roman"/>
           <w:color w:val="000000"/>
         </w:rPr>
+        <w:t>Reviewer, the 2025 Conference on Empirical Methods in Natural Language Processing (EMNLP), Suzhou, China, November 2025</w:t>
+      </w:r>
+    </w:p>
+    <w:p>
+      <w:pPr>
+        <w:numPr>
+          <w:ilvl w:val="0"/>
+          <w:numId w:val="1"/>
+        </w:numPr>
+        <w:tabs>
+          <w:tab w:val="left" w:pos="1440"/>
+        </w:tabs>
+        <w:rPr>
+          <w:rFonts w:ascii="Times New Roman"/>
+          <w:color w:val="000000"/>
+        </w:rPr>
+      </w:pPr>
+      <w:r>
+        <w:rPr>
+          <w:rFonts w:ascii="Times New Roman"/>
+          <w:color w:val="000000"/>
+        </w:rPr>
         <w:t>Program Committee Member, the 51st International Conference on Very Large Data Bases (VLDB), London, UK, August 2025</w:t>
+      </w:r>
+    </w:p>
+    <w:p>
+      <w:pPr>
+        <w:numPr>
+          <w:ilvl w:val="0"/>
+          <w:numId w:val="1"/>
+        </w:numPr>
+        <w:tabs>
+          <w:tab w:val="left" w:pos="1440"/>
+        </w:tabs>
+        <w:rPr>
+          <w:rFonts w:ascii="Times New Roman"/>
+          <w:color w:val="000000"/>
+        </w:rPr>
+      </w:pPr>
+      <w:r>
+        <w:rPr>
+          <w:rFonts w:ascii="Times New Roman"/>
+          <w:color w:val="000000"/>
+        </w:rPr>
+        <w:t>Reviewer, the 63rd Annual Meeting of the Association for Computational Linguistics (ACL), Vienna, Austria, July 2025</w:t>
       </w:r>
     </w:p>
     <w:p>

</xml_diff>

<commit_message>
Fix typos in cv-full PC list (30th EDBT, 45th VLDB, 22nd DEXA, ACM SIGKDD, Kuala Lumpur)
Co-Authored-By: Claude Opus 5.5 <noreply@anthropic.com>
</commit_message>
<xml_diff>
--- a/resume/cv-full.docx
+++ b/resume/cv-full.docx
@@ -4768,7 +4768,7 @@
           <w:rFonts w:ascii="Times New Roman"/>
           <w:color w:val="000000"/>
         </w:rPr>
-        <w:t>nd</w:t>
+        <w:t>th</w:t>
       </w:r>
       <w:r>
         <w:rPr>
@@ -5379,7 +5379,7 @@
           <w:rFonts w:ascii="Times New Roman"/>
           <w:color w:val="000000"/>
         </w:rPr>
-        <w:t>IEEE International Conference on Data Engineering (ICDE), Kuala Lumper, Malaysia, May 2022</w:t>
+        <w:t>IEEE International Conference on Data Engineering (ICDE), Kuala Lumpur, Malaysia, May 2022</w:t>
       </w:r>
     </w:p>
     <w:p>
@@ -5726,7 +5726,7 @@
         <w:rPr>
           <w:rFonts w:ascii="Times New Roman"/>
         </w:rPr>
-        <w:t xml:space="preserve">nd International Conference on Very Large Data Bases (VLDB), </w:t>
+        <w:t xml:space="preserve">th International Conference on Very Large Data Bases (VLDB), </w:t>
       </w:r>
       <w:r>
         <w:rPr>
@@ -6250,7 +6250,7 @@
         <w:rPr>
           <w:rFonts w:ascii="Times New Roman"/>
         </w:rPr>
-        <w:t>AMC SIGKDD Conference on Knowledge Discovery and Data Mining (KDD), San Francisco, CA, USA, August 2016</w:t>
+        <w:t>ACM SIGKDD Conference on Knowledge Discovery and Data Mining (KDD), San Francisco, CA, USA, August 2016</w:t>
       </w:r>
     </w:p>
     <w:p>
@@ -7074,7 +7074,7 @@
         <w:rPr>
           <w:rFonts w:ascii="Times New Roman"/>
         </w:rPr>
-        <w:t>Program Committee Member, the 22th </w:t>
+        <w:t xml:space="preserve">Program Committee Member, the 22nd </w:t>
       </w:r>
       <w:hyperlink ns2:id="rId22" w:history="1">
         <w:r>

</xml_diff>

<commit_message>
Remove non-existent SIGMOD 2025 Distinguished PC member honor from cv-full and cv-short
Co-Authored-By: Claude Opus 5.5 <noreply@anthropic.com>
</commit_message>
<xml_diff>
--- a/resume/cv-full.docx
+++ b/resume/cv-full.docx
@@ -2167,20 +2167,6 @@
           <w:rFonts w:ascii="Times New Roman"/>
         </w:rPr>
         <w:t>Sigmod 2026 Distinguished PC Member, 2026</w:t>
-      </w:r>
-    </w:p>
-    <w:p>
-      <w:pPr>
-        <w:ind w:leftChars="180" w:left="1260" w:hangingChars="450" w:hanging="900"/>
-        <w:rPr>
-          <w:rFonts w:ascii="Times New Roman"/>
-        </w:rPr>
-      </w:pPr>
-      <w:r>
-        <w:rPr>
-          <w:rFonts w:ascii="Times New Roman"/>
-        </w:rPr>
-        <w:t xml:space="preserve">Sigmod 2025 Distinguished PC member, 2025</w:t>
       </w:r>
     </w:p>
     <w:p>

</xml_diff>

<commit_message>
Add SIGMOD 2027 Industry Track PC membership (about.md, cv-short, cv-full)
Co-Authored-By: Claude Opus 5.5 <noreply@anthropic.com>
</commit_message>
<xml_diff>
--- a/resume/cv-full.docx
+++ b/resume/cv-full.docx
@@ -4719,6 +4719,28 @@
         </w:rPr>
         <w:lastRenderedPageBreak/>
         <w:t>Programming Committee Members</w:t>
+      </w:r>
+    </w:p>
+    <w:p>
+      <w:pPr>
+        <w:numPr>
+          <w:ilvl w:val="0"/>
+          <w:numId w:val="1"/>
+        </w:numPr>
+        <w:tabs>
+          <w:tab w:val="left" w:pos="1440"/>
+        </w:tabs>
+        <w:rPr>
+          <w:rFonts w:ascii="Times New Roman"/>
+          <w:color w:val="000000"/>
+        </w:rPr>
+      </w:pPr>
+      <w:r>
+        <w:rPr>
+          <w:rFonts w:ascii="Times New Roman"/>
+          <w:color w:val="000000"/>
+        </w:rPr>
+        <w:t>Industry Track Program Committee Member, the 53rd ACM International Conference on Management of Data (SIGMOD), Huntington Beach, CA, June 2027</w:t>
       </w:r>
     </w:p>
     <w:p>

</xml_diff>

<commit_message>
cv-full: add SAP hybrid-table HTAP consulting project (2026-2027)
Co-Authored-By: Claude Opus 5.5 <noreply@anthropic.com>
</commit_message>
<xml_diff>
--- a/resume/cv-full.docx
+++ b/resume/cv-full.docx
@@ -15,7 +15,7 @@
         <w:rPr>
           <w:rFonts w:ascii="Times New Roman" w:hint="eastAsia"/>
         </w:rPr>
-        <w:t>October 20, 2026</w:t>
+        <w:t>October 26, 2026</w:t>
       </w:r>
     </w:p>
     <w:p>
@@ -22229,6 +22229,24 @@
           <w:rFonts w:ascii="Times New Roman"/>
         </w:rPr>
         <w:t xml:space="preserve">Ministry of Science and ICT, “Development of a Computing System for Compound·Long-horizon AI Acceleration,” 2026 ~ 2033. (₩7,750,000,000)</w:t>
+      </w:r>
+    </w:p>
+    <w:p>
+      <w:pPr>
+        <w:numPr>
+          <w:ilvl w:val="0"/>
+          <w:numId w:val="4"/>
+        </w:numPr>
+        <w:spacing w:line="20" w:lineRule="atLeast"/>
+        <w:rPr>
+          <w:rFonts w:ascii="Times New Roman"/>
+        </w:rPr>
+      </w:pPr>
+      <w:r>
+        <w:rPr>
+          <w:rFonts w:ascii="Times New Roman"/>
+        </w:rPr>
+        <w:t>SAP, “Consulting on Low-Cost HTAP through Hybrid Tables in SAP HANA (In-Memory Fragment and SoF Storage Fragment),” 2026 ~ 2027 (PI). (€40,000)</w:t>
       </w:r>
     </w:p>
     <w:p>

</xml_diff>

<commit_message>
cv-full: add AI Star Fellowship Program (2026-2031)
Co-Authored-By: Claude Opus 5.5 <noreply@anthropic.com>
</commit_message>
<xml_diff>
--- a/resume/cv-full.docx
+++ b/resume/cv-full.docx
@@ -22229,6 +22229,24 @@
           <w:rFonts w:ascii="Times New Roman"/>
         </w:rPr>
         <w:t xml:space="preserve">Ministry of Science and ICT, “Development of a Computing System for Compound·Long-horizon AI Acceleration,” 2026 ~ 2033. (₩7,750,000,000)</w:t>
+      </w:r>
+    </w:p>
+    <w:p>
+      <w:pPr>
+        <w:numPr>
+          <w:ilvl w:val="0"/>
+          <w:numId w:val="4"/>
+        </w:numPr>
+        <w:spacing w:line="20" w:lineRule="atLeast"/>
+        <w:rPr>
+          <w:rFonts w:ascii="Times New Roman"/>
+        </w:rPr>
+      </w:pPr>
+      <w:r>
+        <w:rPr>
+          <w:rFonts w:ascii="Times New Roman"/>
+        </w:rPr>
+        <w:t>Ministry of Science and ICT, “AI Star Fellowship Program,” 2026 ~ 2031. (₩1,000,000,000)</w:t>
       </w:r>
     </w:p>
     <w:p>

</xml_diff>

<commit_message>
cv-full: US 12,632,440 granted; add US 19/583,636, US 19/801,367, PCT/KR2026/006317
Co-Authored-By: Claude Opus 5.5 <noreply@anthropic.com>
</commit_message>
<xml_diff>
--- a/resume/cv-full.docx
+++ b/resume/cv-full.docx
@@ -25745,6 +25745,167 @@
         <w:rPr>
           <w:rFonts w:ascii="Times New Roman" w:hint="eastAsia"/>
         </w:rPr>
+        <w:t>, and Yun, J., “Method of Processing User Query and Retrieval Apparatus for Executing the Same,” U.S. App No. 19/801,367, Sept. 2026.</w:t>
+      </w:r>
+    </w:p>
+    <w:p>
+      <w:pPr>
+        <w:numPr>
+          <w:ilvl w:val="0"/>
+          <w:numId w:val="5"/>
+        </w:numPr>
+        <w:tabs>
+          <w:tab w:val="left" w:pos="448"/>
+        </w:tabs>
+        <w:rPr>
+          <w:rFonts w:ascii="Times New Roman"/>
+        </w:rPr>
+      </w:pPr>
+      <w:r>
+        <w:rPr>
+          <w:rFonts w:ascii="Times New Roman" w:hint="eastAsia"/>
+          <w:u w:val="single"/>
+        </w:rPr>
+        <w:t>Han, W.</w:t>
+      </w:r>
+      <w:r>
+        <w:rPr>
+          <w:rFonts w:ascii="Times New Roman" w:hint="eastAsia"/>
+        </w:rPr>
+        <w:t xml:space="preserve">, Kang, H., and </w:t>
+      </w:r>
+      <w:r>
+        <w:rPr>
+          <w:rFonts w:ascii="Times New Roman"/>
+        </w:rPr>
+        <w:t>Park</w:t>
+      </w:r>
+      <w:r>
+        <w:rPr>
+          <w:rFonts w:ascii="Times New Roman" w:hint="eastAsia"/>
+        </w:rPr>
+        <w:t xml:space="preserve">, </w:t>
+      </w:r>
+      <w:r>
+        <w:rPr>
+          <w:rFonts w:ascii="Times New Roman"/>
+        </w:rPr>
+        <w:t>S</w:t>
+      </w:r>
+      <w:r>
+        <w:rPr>
+          <w:rFonts w:ascii="Times New Roman" w:hint="eastAsia"/>
+        </w:rPr>
+        <w:t>.,</w:t>
+      </w:r>
+      <w:r>
+        <w:rPr>
+          <w:rFonts w:ascii="Times New Roman"/>
+        </w:rPr>
+        <w:t xml:space="preserve"> “</w:t>
+      </w:r>
+      <w:r>
+        <w:rPr>
+          <w:rFonts w:ascii="Times New Roman"/>
+        </w:rPr>
+        <w:t>Method and Device for Detecting Anomaly in Log Data</w:t>
+      </w:r>
+      <w:r>
+        <w:rPr>
+          <w:rFonts w:ascii="Times New Roman"/>
+        </w:rPr>
+        <w:t>,” U.S. Patent No. 12,632,440 B2, May</w:t>
+      </w:r>
+      <w:r>
+        <w:rPr>
+          <w:rFonts w:ascii="Times New Roman"/>
+        </w:rPr>
+      </w:r>
+      <w:r>
+        <w:rPr>
+          <w:rFonts w:ascii="Times New Roman"/>
+        </w:rPr>
+        <w:t xml:space="preserve"> 2026.</w:t>
+      </w:r>
+    </w:p>
+    <w:p>
+      <w:pPr>
+        <w:numPr>
+          <w:ilvl w:val="0"/>
+          <w:numId w:val="5"/>
+        </w:numPr>
+        <w:tabs>
+          <w:tab w:val="left" w:pos="448"/>
+        </w:tabs>
+        <w:rPr>
+          <w:rFonts w:ascii="Times New Roman"/>
+        </w:rPr>
+      </w:pPr>
+      <w:r>
+        <w:rPr>
+          <w:rFonts w:ascii="Times New Roman" w:hint="eastAsia"/>
+          <w:u w:val="single"/>
+        </w:rPr>
+        <w:t>Han, W.</w:t>
+      </w:r>
+      <w:r>
+        <w:rPr>
+          <w:rFonts w:ascii="Times New Roman" w:hint="eastAsia"/>
+        </w:rPr>
+        <w:t>, and Yun, J., “Method of Processing User Query and Retrieval Apparatus for Executing the Same,” PCT/KR2026/006317, May 2026.</w:t>
+      </w:r>
+    </w:p>
+    <w:p>
+      <w:pPr>
+        <w:numPr>
+          <w:ilvl w:val="0"/>
+          <w:numId w:val="5"/>
+        </w:numPr>
+        <w:tabs>
+          <w:tab w:val="left" w:pos="448"/>
+        </w:tabs>
+        <w:rPr>
+          <w:rFonts w:ascii="Times New Roman"/>
+        </w:rPr>
+      </w:pPr>
+      <w:r>
+        <w:rPr>
+          <w:rFonts w:ascii="Times New Roman" w:hint="eastAsia"/>
+          <w:u w:val="single"/>
+        </w:rPr>
+        <w:t>Han, W.</w:t>
+      </w:r>
+      <w:r>
+        <w:rPr>
+          <w:rFonts w:ascii="Times New Roman" w:hint="eastAsia"/>
+        </w:rPr>
+        <w:t>, Lee, T., and Ha, J., “Method and Apparatus for Optimizing Query of Graph Database, and Graph Database System Including Same,” U.S. App No. 19/583,636, Apr. 2026.</w:t>
+      </w:r>
+    </w:p>
+    <w:p>
+      <w:pPr>
+        <w:numPr>
+          <w:ilvl w:val="0"/>
+          <w:numId w:val="5"/>
+        </w:numPr>
+        <w:tabs>
+          <w:tab w:val="left" w:pos="448"/>
+        </w:tabs>
+        <w:rPr>
+          <w:rFonts w:ascii="Times New Roman"/>
+        </w:rPr>
+      </w:pPr>
+      <w:r>
+        <w:rPr>
+          <w:rFonts w:ascii="Times New Roman" w:hint="eastAsia"/>
+          <w:u w:val="single"/>
+        </w:rPr>
+        <w:t>Han, W.</w:t>
+      </w:r>
+      <w:r>
+        <w:rPr>
+          <w:rFonts w:ascii="Times New Roman" w:hint="eastAsia"/>
+        </w:rPr>
         <w:t>, Kang, H., and Kim, H.,</w:t>
       </w:r>
       <w:r>
@@ -26247,87 +26408,6 @@
           <w:rFonts w:ascii="Times New Roman"/>
         </w:rPr>
         <w:t>ccording to Question,” PCT/KR2025/003037, March 2025.</w:t>
-      </w:r>
-    </w:p>
-    <w:p>
-      <w:pPr>
-        <w:numPr>
-          <w:ilvl w:val="0"/>
-          <w:numId w:val="5"/>
-        </w:numPr>
-        <w:tabs>
-          <w:tab w:val="left" w:pos="448"/>
-        </w:tabs>
-        <w:rPr>
-          <w:rFonts w:ascii="Times New Roman"/>
-        </w:rPr>
-      </w:pPr>
-      <w:r>
-        <w:rPr>
-          <w:rFonts w:ascii="Times New Roman" w:hint="eastAsia"/>
-          <w:u w:val="single"/>
-        </w:rPr>
-        <w:t>Han, W.</w:t>
-      </w:r>
-      <w:r>
-        <w:rPr>
-          <w:rFonts w:ascii="Times New Roman" w:hint="eastAsia"/>
-        </w:rPr>
-        <w:t xml:space="preserve">, Kang, H., and </w:t>
-      </w:r>
-      <w:r>
-        <w:rPr>
-          <w:rFonts w:ascii="Times New Roman"/>
-        </w:rPr>
-        <w:t>Park</w:t>
-      </w:r>
-      <w:r>
-        <w:rPr>
-          <w:rFonts w:ascii="Times New Roman" w:hint="eastAsia"/>
-        </w:rPr>
-        <w:t xml:space="preserve">, </w:t>
-      </w:r>
-      <w:r>
-        <w:rPr>
-          <w:rFonts w:ascii="Times New Roman"/>
-        </w:rPr>
-        <w:t>S</w:t>
-      </w:r>
-      <w:r>
-        <w:rPr>
-          <w:rFonts w:ascii="Times New Roman" w:hint="eastAsia"/>
-        </w:rPr>
-        <w:t>.,</w:t>
-      </w:r>
-      <w:r>
-        <w:rPr>
-          <w:rFonts w:ascii="Times New Roman"/>
-        </w:rPr>
-        <w:t xml:space="preserve"> “</w:t>
-      </w:r>
-      <w:r>
-        <w:rPr>
-          <w:rFonts w:ascii="Times New Roman"/>
-        </w:rPr>
-        <w:t>Method and Device for Detecting Anomaly in Log Data</w:t>
-      </w:r>
-      <w:r>
-        <w:rPr>
-          <w:rFonts w:ascii="Times New Roman"/>
-        </w:rPr>
-        <w:t>,” U.S. App No. 18/935,330, Nov</w:t>
-      </w:r>
-      <w:r>
-        <w:rPr>
-          <w:rFonts w:ascii="Times New Roman"/>
-        </w:rPr>
-        <w:t>.</w:t>
-      </w:r>
-      <w:r>
-        <w:rPr>
-          <w:rFonts w:ascii="Times New Roman"/>
-        </w:rPr>
-        <w:t xml:space="preserve"> 2024.</w:t>
       </w:r>
     </w:p>
     <w:p>

</xml_diff>

<commit_message>
cv-full: remove provisional US 63/610,344 (priority basis of US 12,632,440)
Co-Authored-By: Claude Opus 5.5 <noreply@anthropic.com>
</commit_message>
<xml_diff>
--- a/resume/cv-full.docx
+++ b/resume/cv-full.docx
@@ -26639,183 +26639,6 @@
           <w:rFonts w:ascii="Times New Roman"/>
         </w:rPr>
         <w:t>2024.</w:t>
-      </w:r>
-    </w:p>
-    <w:p>
-      <w:pPr>
-        <w:numPr>
-          <w:ilvl w:val="0"/>
-          <w:numId w:val="5"/>
-        </w:numPr>
-        <w:tabs>
-          <w:tab w:val="left" w:pos="448"/>
-        </w:tabs>
-        <w:rPr>
-          <w:rFonts w:ascii="Times New Roman"/>
-        </w:rPr>
-      </w:pPr>
-      <w:r>
-        <w:rPr>
-          <w:rFonts w:ascii="Times New Roman" w:hint="eastAsia"/>
-          <w:u w:val="single"/>
-        </w:rPr>
-        <w:t>Han, W.,</w:t>
-      </w:r>
-      <w:r>
-        <w:rPr>
-          <w:rFonts w:ascii="Times New Roman" w:hint="eastAsia"/>
-        </w:rPr>
-        <w:t xml:space="preserve"> Kang, H., and Park, S.,</w:t>
-      </w:r>
-      <w:r>
-        <w:rPr>
-          <w:rFonts w:ascii="Times New Roman"/>
-        </w:rPr>
-        <w:t xml:space="preserve"> “</w:t>
-      </w:r>
-      <w:r>
-        <w:rPr>
-          <w:rFonts w:ascii="Times New Roman"/>
-        </w:rPr>
-        <w:t xml:space="preserve">A </w:t>
-      </w:r>
-      <w:r>
-        <w:rPr>
-          <w:rFonts w:ascii="Times New Roman"/>
-        </w:rPr>
-        <w:t>M</w:t>
-      </w:r>
-      <w:r>
-        <w:rPr>
-          <w:rFonts w:ascii="Times New Roman"/>
-        </w:rPr>
-        <w:t xml:space="preserve">ethod and </w:t>
-      </w:r>
-      <w:r>
-        <w:rPr>
-          <w:rFonts w:ascii="Times New Roman"/>
-        </w:rPr>
-        <w:t>D</w:t>
-      </w:r>
-      <w:r>
-        <w:rPr>
-          <w:rFonts w:ascii="Times New Roman"/>
-        </w:rPr>
-        <w:t xml:space="preserve">evice for </w:t>
-      </w:r>
-      <w:r>
-        <w:rPr>
-          <w:rFonts w:ascii="Times New Roman"/>
-        </w:rPr>
-        <w:t>D</w:t>
-      </w:r>
-      <w:r>
-        <w:rPr>
-          <w:rFonts w:ascii="Times New Roman"/>
-        </w:rPr>
-        <w:t xml:space="preserve">etecting </w:t>
-      </w:r>
-      <w:r>
-        <w:rPr>
-          <w:rFonts w:ascii="Times New Roman"/>
-        </w:rPr>
-        <w:t>A</w:t>
-      </w:r>
-      <w:r>
-        <w:rPr>
-          <w:rFonts w:ascii="Times New Roman"/>
-        </w:rPr>
-        <w:t xml:space="preserve">nomalies in </w:t>
-      </w:r>
-      <w:r>
-        <w:rPr>
-          <w:rFonts w:ascii="Times New Roman"/>
-        </w:rPr>
-        <w:t>D</w:t>
-      </w:r>
-      <w:r>
-        <w:rPr>
-          <w:rFonts w:ascii="Times New Roman"/>
-        </w:rPr>
-        <w:t xml:space="preserve">atabase </w:t>
-      </w:r>
-      <w:r>
-        <w:rPr>
-          <w:rFonts w:ascii="Times New Roman"/>
-        </w:rPr>
-        <w:t>P</w:t>
-      </w:r>
-      <w:r>
-        <w:rPr>
-          <w:rFonts w:ascii="Times New Roman"/>
-        </w:rPr>
-        <w:t xml:space="preserve">erformance from </w:t>
-      </w:r>
-      <w:r>
-        <w:rPr>
-          <w:rFonts w:ascii="Times New Roman"/>
-        </w:rPr>
-        <w:t>L</w:t>
-      </w:r>
-      <w:r>
-        <w:rPr>
-          <w:rFonts w:ascii="Times New Roman"/>
-        </w:rPr>
-        <w:t xml:space="preserve">og </w:t>
-      </w:r>
-      <w:r>
-        <w:rPr>
-          <w:rFonts w:ascii="Times New Roman"/>
-        </w:rPr>
-        <w:t>D</w:t>
-      </w:r>
-      <w:r>
-        <w:rPr>
-          <w:rFonts w:ascii="Times New Roman"/>
-        </w:rPr>
-        <w:t xml:space="preserve">ata, and </w:t>
-      </w:r>
-      <w:r>
-        <w:rPr>
-          <w:rFonts w:ascii="Times New Roman"/>
-        </w:rPr>
-        <w:t>A</w:t>
-      </w:r>
-      <w:r>
-        <w:rPr>
-          <w:rFonts w:ascii="Times New Roman"/>
-        </w:rPr>
-        <w:t xml:space="preserve">nalyzing the </w:t>
-      </w:r>
-      <w:r>
-        <w:rPr>
-          <w:rFonts w:ascii="Times New Roman"/>
-        </w:rPr>
-        <w:t>C</w:t>
-      </w:r>
-      <w:r>
-        <w:rPr>
-          <w:rFonts w:ascii="Times New Roman"/>
-        </w:rPr>
-        <w:t>auses</w:t>
-      </w:r>
-      <w:r>
-        <w:rPr>
-          <w:rFonts w:ascii="Times New Roman"/>
-        </w:rPr>
-        <w:t xml:space="preserve">,” U.S. App No. </w:t>
-      </w:r>
-      <w:r>
-        <w:rPr>
-          <w:rFonts w:ascii="Times New Roman"/>
-        </w:rPr>
-        <w:t>63/610,344</w:t>
-      </w:r>
-      <w:r>
-        <w:rPr>
-          <w:rFonts w:ascii="Times New Roman"/>
-        </w:rPr>
-        <w:t>, Dec. 2023.</w:t>
       </w:r>
     </w:p>
     <w:p>

</xml_diff>

<commit_message>
cv-full: fix typos (Break-Through, 2020~2021, quotes)
Co-Authored-By: Claude Opus 5.5 <noreply@anthropic.com>
</commit_message>
<xml_diff>
--- a/resume/cv-full.docx
+++ b/resume/cv-full.docx
@@ -19568,7 +19568,7 @@
         <w:rPr>
           <w:rFonts w:ascii="Times New Roman"/>
         </w:rPr>
-        <w:t xml:space="preserve">Cost-Based Predictive Spatio-Temporal Join," </w:t>
+        <w:t xml:space="preserve">Cost-Based Predictive Spatio-Temporal Join,” </w:t>
       </w:r>
       <w:r>
         <w:rPr>
@@ -23189,7 +23189,7 @@
         <w:rPr>
           <w:rFonts w:ascii="Times New Roman"/>
         </w:rPr>
-        <w:t>“Investigating Break-Though Technologies in Graph Isomorphism Problem,” 2018 ~ 2019</w:t>
+        <w:t>“Investigating Break-Through Technologies in Graph Isomorphism Problem,” 2018 ~ 2019</w:t>
       </w:r>
       <w:r>
         <w:rPr>
@@ -23801,19 +23801,18 @@
         <w:rPr>
           <w:rFonts w:ascii="Times New Roman"/>
         </w:rPr>
-        <w:t>“Table and Column Search based on NLP,” 2020 ~ 2001 (PI)</w:t>
-      </w:r>
-      <w:r>
-        <w:rPr>
-          <w:rFonts w:ascii="Times New Roman"/>
-        </w:rPr>
-        <w:t xml:space="preserve"> </w:t>
-      </w:r>
-      <w:r>
-        <w:rPr>
-          <w:rFonts w:ascii="Times New Roman"/>
-        </w:rPr>
-        <w:t>, (₩</w:t>
+        <w:t>“Table and Column Search based on NLP,” 2020 ~ 2021 (PI),</w:t>
+      </w:r>
+      <w:r>
+        <w:rPr>
+          <w:rFonts w:ascii="Times New Roman"/>
+        </w:rPr>
+      </w:r>
+      <w:r>
+        <w:rPr>
+          <w:rFonts w:ascii="Times New Roman"/>
+        </w:rPr>
+        <w:t xml:space="preserve"> (₩</w:t>
       </w:r>
       <w:r>
         <w:rPr>
@@ -24318,7 +24317,7 @@
         <w:rPr>
           <w:rFonts w:ascii="Times New Roman"/>
         </w:rPr>
-        <w:t>“Investigating Break-Though Technologies in Graph Isomorphism Problem,” 2017 ~ 2018</w:t>
+        <w:t>“Investigating Break-Through Technologies in Graph Isomorphism Problem,” 2017 ~ 2018</w:t>
       </w:r>
       <w:r>
         <w:rPr>
@@ -24608,7 +24607,7 @@
         <w:rPr>
           <w:rFonts w:ascii="Times New Roman"/>
         </w:rPr>
-        <w:t>“Investigating Break-Though Technologies in Graph Isomorphism Problem,”</w:t>
+        <w:t>“Investigating Break-Through Technologies in Graph Isomorphism Problem,”</w:t>
       </w:r>
       <w:r>
         <w:rPr>
@@ -24744,7 +24743,7 @@
         <w:rPr>
           <w:rFonts w:ascii="Times New Roman"/>
         </w:rPr>
-        <w:t>Oracle External Office, “Investigating Break-Though Technologies in Graph Isomorphism Problem,” 201</w:t>
+        <w:t>Oracle External Office, “Investigating Break-Through Technologies in Graph Isomorphism Problem,” 201</w:t>
       </w:r>
       <w:r>
         <w:rPr>
@@ -25006,7 +25005,7 @@
         <w:rPr>
           <w:rFonts w:ascii="Times New Roman"/>
         </w:rPr>
-        <w:t>Oracle External Office, “Investigating Break-Though Technologies in Graph Isomorphism Problem,” 2014 ~ 2015</w:t>
+        <w:t>Oracle External Office, “Investigating Break-Through Technologies in Graph Isomorphism Problem,” 2014 ~ 2015</w:t>
       </w:r>
       <w:r>
         <w:rPr>
@@ -25404,7 +25403,7 @@
         <w:rPr>
           <w:rFonts w:ascii="Times New Roman"/>
         </w:rPr>
-        <w:t xml:space="preserve">cation and Ontology Instance Generation," 2006 </w:t>
+        <w:t xml:space="preserve">cation and Ontology Instance Generation,” 2006 </w:t>
       </w:r>
       <w:r>
         <w:rPr>

</xml_diff>

<commit_message>
cv-full: keep Oracle project title as originally given
Co-Authored-By: Claude Opus 5.5 <noreply@anthropic.com>
</commit_message>
<xml_diff>
--- a/resume/cv-full.docx
+++ b/resume/cv-full.docx
@@ -23189,7 +23189,7 @@
         <w:rPr>
           <w:rFonts w:ascii="Times New Roman"/>
         </w:rPr>
-        <w:t>“Investigating Break-Through Technologies in Graph Isomorphism Problem,” 2018 ~ 2019</w:t>
+        <w:t>“Investigating Break-Though Technologies in Graph Isomorphism Problem,” 2018 ~ 2019</w:t>
       </w:r>
       <w:r>
         <w:rPr>
@@ -24317,7 +24317,7 @@
         <w:rPr>
           <w:rFonts w:ascii="Times New Roman"/>
         </w:rPr>
-        <w:t>“Investigating Break-Through Technologies in Graph Isomorphism Problem,” 2017 ~ 2018</w:t>
+        <w:t>“Investigating Break-Though Technologies in Graph Isomorphism Problem,” 2017 ~ 2018</w:t>
       </w:r>
       <w:r>
         <w:rPr>
@@ -24607,7 +24607,7 @@
         <w:rPr>
           <w:rFonts w:ascii="Times New Roman"/>
         </w:rPr>
-        <w:t>“Investigating Break-Through Technologies in Graph Isomorphism Problem,”</w:t>
+        <w:t>“Investigating Break-Though Technologies in Graph Isomorphism Problem,”</w:t>
       </w:r>
       <w:r>
         <w:rPr>
@@ -24743,7 +24743,7 @@
         <w:rPr>
           <w:rFonts w:ascii="Times New Roman"/>
         </w:rPr>
-        <w:t>Oracle External Office, “Investigating Break-Through Technologies in Graph Isomorphism Problem,” 201</w:t>
+        <w:t>Oracle External Office, “Investigating Break-Though Technologies in Graph Isomorphism Problem,” 201</w:t>
       </w:r>
       <w:r>
         <w:rPr>
@@ -25005,7 +25005,7 @@
         <w:rPr>
           <w:rFonts w:ascii="Times New Roman"/>
         </w:rPr>
-        <w:t>Oracle External Office, “Investigating Break-Through Technologies in Graph Isomorphism Problem,” 2014 ~ 2015</w:t>
+        <w:t>Oracle External Office, “Investigating Break-Though Technologies in Graph Isomorphism Problem,” 2014 ~ 2015</w:t>
       </w:r>
       <w:r>
         <w:rPr>

</xml_diff>

<commit_message>
cv-full: fix Oracle project title typo (Break-Through)
Co-Authored-By: Claude Opus 5.5 <noreply@anthropic.com>
</commit_message>
<xml_diff>
--- a/resume/cv-full.docx
+++ b/resume/cv-full.docx
@@ -23189,7 +23189,7 @@
         <w:rPr>
           <w:rFonts w:ascii="Times New Roman"/>
         </w:rPr>
-        <w:t>“Investigating Break-Though Technologies in Graph Isomorphism Problem,” 2018 ~ 2019</w:t>
+        <w:t>“Investigating Break-Through Technologies in Graph Isomorphism Problem,” 2018 ~ 2019</w:t>
       </w:r>
       <w:r>
         <w:rPr>
@@ -24317,7 +24317,7 @@
         <w:rPr>
           <w:rFonts w:ascii="Times New Roman"/>
         </w:rPr>
-        <w:t>“Investigating Break-Though Technologies in Graph Isomorphism Problem,” 2017 ~ 2018</w:t>
+        <w:t>“Investigating Break-Through Technologies in Graph Isomorphism Problem,” 2017 ~ 2018</w:t>
       </w:r>
       <w:r>
         <w:rPr>
@@ -24607,7 +24607,7 @@
         <w:rPr>
           <w:rFonts w:ascii="Times New Roman"/>
         </w:rPr>
-        <w:t>“Investigating Break-Though Technologies in Graph Isomorphism Problem,”</w:t>
+        <w:t>“Investigating Break-Through Technologies in Graph Isomorphism Problem,”</w:t>
       </w:r>
       <w:r>
         <w:rPr>
@@ -24743,7 +24743,7 @@
         <w:rPr>
           <w:rFonts w:ascii="Times New Roman"/>
         </w:rPr>
-        <w:t>Oracle External Office, “Investigating Break-Though Technologies in Graph Isomorphism Problem,” 201</w:t>
+        <w:t>Oracle External Office, “Investigating Break-Through Technologies in Graph Isomorphism Problem,” 201</w:t>
       </w:r>
       <w:r>
         <w:rPr>
@@ -25005,7 +25005,7 @@
         <w:rPr>
           <w:rFonts w:ascii="Times New Roman"/>
         </w:rPr>
-        <w:t>Oracle External Office, “Investigating Break-Though Technologies in Graph Isomorphism Problem,” 2014 ~ 2015</w:t>
+        <w:t>Oracle External Office, “Investigating Break-Through Technologies in Graph Isomorphism Problem,” 2014 ~ 2015</w:t>
       </w:r>
       <w:r>
         <w:rPr>

</xml_diff>

<commit_message>
cv-full: drop 'Consulting on' prefix from SAP project titles (CV convention)
Co-Authored-By: Claude Opus 5.5 <noreply@anthropic.com>
</commit_message>
<xml_diff>
--- a/resume/cv-full.docx
+++ b/resume/cv-full.docx
@@ -22264,7 +22264,7 @@
         <w:rPr>
           <w:rFonts w:ascii="Times New Roman"/>
         </w:rPr>
-        <w:t>SAP, “Consulting on Low-Cost HTAP through Hybrid Tables in SAP HANA (In-Memory Fragment and SoF Storage Fragment),” 2026 ~ 2027 (PI). (€40,000)</w:t>
+        <w:t>SAP, “Low-Cost HTAP through Hybrid Tables in SAP HANA (In-Memory Fragment and SoF Storage Fragment),” 2026 ~ 2027 (PI). (€40,000)</w:t>
       </w:r>
     </w:p>
     <w:p>
@@ -22282,7 +22282,7 @@
         <w:rPr>
           <w:rFonts w:ascii="Times New Roman"/>
         </w:rPr>
-        <w:t xml:space="preserve">SAP, “Consulting on Accelerating Cache Management in SAP HANA,” 2025 ~ 2026 (PI). (€40,000)</w:t>
+        <w:t>SAP, “Accelerating Cache Management in SAP HANA,” 2025 ~ 2026 (PI). (€40,000)</w:t>
       </w:r>
     </w:p>
     <w:p>
@@ -22300,7 +22300,7 @@
         <w:rPr>
           <w:rFonts w:ascii="Times New Roman"/>
         </w:rPr>
-        <w:t xml:space="preserve">SAP, “Consulting on Recent Database Trends for SAP HANA,” 2025 ~ 2026 (PI). (€40,000)</w:t>
+        <w:t>SAP, “Recent Database Trends for SAP HANA,” 2025 ~ 2026 (PI). (€40,000)</w:t>
       </w:r>
     </w:p>
     <w:p>
@@ -22678,7 +22678,7 @@
         <w:rPr>
           <w:rFonts w:ascii="Times New Roman"/>
         </w:rPr>
-        <w:t xml:space="preserve">SAP, “Consulting on Accelerating Cache Management in SAP HANA,” 2024 ~ 2025 (PI). (€50,000)</w:t>
+        <w:t>SAP, “Accelerating Cache Management in SAP HANA,” 2024 ~ 2025 (PI). (€50,000)</w:t>
       </w:r>
     </w:p>
     <w:p>

</xml_diff>

<commit_message>
cv-full: add Zero-Trust AI Research Center (PI); AI Guardians not PI
Co-Authored-By: Claude Opus 5.5 <noreply@anthropic.com>
</commit_message>
<xml_diff>
--- a/resume/cv-full.docx
+++ b/resume/cv-full.docx
@@ -22696,7 +22696,25 @@
         <w:rPr>
           <w:rFonts w:ascii="Times New Roman" w:hint="eastAsia"/>
         </w:rPr>
-        <w:t>Ministry of Science and ICT, “AI Guardians: Development of Robust, Controllable, and Unbiased Trustworthy AI Technology,” 2024 ~ 2028 (PI). (₩6,930,000,000)</w:t>
+        <w:t>Ministry of Education (Glocal University 30), “Zero-Trust AI Research Center,” 2024 ~ 2028 (PI). (₩3,750,000,000)</w:t>
+      </w:r>
+    </w:p>
+    <w:p>
+      <w:pPr>
+        <w:numPr>
+          <w:ilvl w:val="0"/>
+          <w:numId w:val="4"/>
+        </w:numPr>
+        <w:spacing w:line="20" w:lineRule="atLeast"/>
+        <w:rPr>
+          <w:rFonts w:ascii="Times New Roman"/>
+        </w:rPr>
+      </w:pPr>
+      <w:r>
+        <w:rPr>
+          <w:rFonts w:ascii="Times New Roman" w:hint="eastAsia"/>
+        </w:rPr>
+        <w:t>Ministry of Science and ICT, “AI Guardians: Development of Robust, Controllable, and Unbiased Trustworthy AI Technology,” 2024 ~ 2028. (₩6,930,000,000)</w:t>
       </w:r>
     </w:p>
     <w:p>

</xml_diff>

<commit_message>
cv-full: remove Zero-Trust AI Research Center entry
Co-Authored-By: Claude Opus 5.5 <noreply@anthropic.com>
</commit_message>
<xml_diff>
--- a/resume/cv-full.docx
+++ b/resume/cv-full.docx
@@ -22679,24 +22679,6 @@
           <w:rFonts w:ascii="Times New Roman"/>
         </w:rPr>
         <w:t>SAP, “Accelerating Cache Management in SAP HANA,” 2024 ~ 2025 (PI). (€50,000)</w:t>
-      </w:r>
-    </w:p>
-    <w:p>
-      <w:pPr>
-        <w:numPr>
-          <w:ilvl w:val="0"/>
-          <w:numId w:val="4"/>
-        </w:numPr>
-        <w:spacing w:line="20" w:lineRule="atLeast"/>
-        <w:rPr>
-          <w:rFonts w:ascii="Times New Roman"/>
-        </w:rPr>
-      </w:pPr>
-      <w:r>
-        <w:rPr>
-          <w:rFonts w:ascii="Times New Roman" w:hint="eastAsia"/>
-        </w:rPr>
-        <w:t>Ministry of Education (Glocal University 30), “Zero-Trust AI Research Center,” 2024 ~ 2028 (PI). (₩3,750,000,000)</w:t>
       </w:r>
     </w:p>
     <w:p>

</xml_diff>

<commit_message>
cv-full: evidence-based project fixes (BK21 amount/agency, SAP periods, vector DB end year, drop unexecuted 2022 Group-By)
Co-Authored-By: Claude Opus 5.5 <noreply@anthropic.com>
</commit_message>
<xml_diff>
--- a/resume/cv-full.docx
+++ b/resume/cv-full.docx
@@ -15,7 +15,7 @@
         <w:rPr>
           <w:rFonts w:ascii="Times New Roman" w:hint="eastAsia"/>
         </w:rPr>
-        <w:t>October 26, 2026</w:t>
+        <w:t>October 27, 2026</w:t>
       </w:r>
     </w:p>
     <w:p>
@@ -22733,7 +22733,7 @@
         <w:rPr>
           <w:rFonts w:ascii="Times New Roman"/>
         </w:rPr>
-        <w:t>,” 2024 ~ 2028. (₩420,000,000</w:t>
+        <w:t>,” 2024 ~ 2027. (₩420,000,000</w:t>
       </w:r>
       <w:r>
         <w:rPr>
@@ -23021,13 +23021,13 @@
         <w:rPr>
           <w:rFonts w:ascii="Times New Roman" w:hint="eastAsia"/>
         </w:rPr>
-        <w:t xml:space="preserve">Ministry of Science and ICT, </w:t>
-      </w:r>
-      <w:r>
-        <w:rPr>
-          <w:rFonts w:ascii="Times New Roman"/>
-        </w:rPr>
-        <w:t>“Brain Korea 21,” 2020 ~ 2027 (PI). (₩5,886,978,425)</w:t>
+        <w:t xml:space="preserve">Ministry of Education, </w:t>
+      </w:r>
+      <w:r>
+        <w:rPr>
+          <w:rFonts w:ascii="Times New Roman"/>
+        </w:rPr>
+        <w:t>“Brain Korea 21,” 2020 ~ 2027 (PI). (₩5,466,024,515)</w:t>
       </w:r>
     </w:p>
     <w:p>
@@ -23333,7 +23333,7 @@
         <w:rPr>
           <w:rFonts w:ascii="Times New Roman"/>
         </w:rPr>
-        <w:t>,” 2023 (PI). (€50,000)</w:t>
+        <w:t>,” 2023 ~ 2024 (PI). (€30,000)</w:t>
       </w:r>
     </w:p>
     <w:p>
@@ -23931,6 +23931,24 @@
       </w:pPr>
       <w:r>
         <w:rPr>
+          <w:rFonts w:ascii="Times New Roman"/>
+        </w:rPr>
+        <w:t>SAP, “Processing Online DDL Queries Using OSTR under Concurrent DMLs,” 2019 ~ 2020 (PI). (€30,000)</w:t>
+      </w:r>
+    </w:p>
+    <w:p>
+      <w:pPr>
+        <w:numPr>
+          <w:ilvl w:val="0"/>
+          <w:numId w:val="4"/>
+        </w:numPr>
+        <w:spacing w:line="20" w:lineRule="atLeast"/>
+        <w:rPr>
+          <w:rFonts w:ascii="Times New Roman"/>
+        </w:rPr>
+      </w:pPr>
+      <w:r>
+        <w:rPr>
           <w:rFonts w:ascii="Times New Roman" w:hint="eastAsia"/>
         </w:rPr>
         <w:t xml:space="preserve">SAP, </w:t>
@@ -23939,7 +23957,7 @@
         <w:rPr>
           <w:rFonts w:ascii="Times New Roman"/>
         </w:rPr>
-        <w:t>“Supporting Online DDL and the Global Index Using a Replication Engine,” 2019 (PI). (</w:t>
+        <w:t>“Supporting Online DDL and the Global Index Using a Replication Engine,” 2018 ~ 2019 (PI). (</w:t>
       </w:r>
       <w:r>
         <w:rPr>
@@ -24269,31 +24287,27 @@
         <w:rPr>
           <w:rFonts w:ascii="Times New Roman"/>
         </w:rPr>
-        <w:t>Ministry of Science, ICT and Future Planning, “Development of Enabling Software Technology for Integration and Inference Using Big Complex Type Data,” 2017 ~ 2020. (₩</w:t>
-      </w:r>
-      <w:r>
-        <w:rPr>
-          <w:rFonts w:ascii="Times New Roman"/>
-        </w:rPr>
-        <w:t>445</w:t>
-      </w:r>
-      <w:r>
-        <w:rPr>
-          <w:rFonts w:ascii="Times New Roman"/>
-        </w:rPr>
-        <w:t>,</w:t>
-      </w:r>
-      <w:r>
-        <w:rPr>
-          <w:rFonts w:ascii="Times New Roman"/>
-        </w:rPr>
-        <w:t>2</w:t>
-      </w:r>
-      <w:r>
-        <w:rPr>
-          <w:rFonts w:ascii="Times New Roman"/>
-        </w:rPr>
-        <w:t>00,000)</w:t>
+        <w:t>Ministry of Science, ICT and Future Planning, “Development of Enabling Software Technology for Integration and Inference Using Big Complex Type Data,” 2017 ~ 2020. (₩440,160,000)</w:t>
+      </w:r>
+      <w:r>
+        <w:rPr>
+          <w:rFonts w:ascii="Times New Roman"/>
+        </w:rPr>
+      </w:r>
+      <w:r>
+        <w:rPr>
+          <w:rFonts w:ascii="Times New Roman"/>
+        </w:rPr>
+      </w:r>
+      <w:r>
+        <w:rPr>
+          <w:rFonts w:ascii="Times New Roman"/>
+        </w:rPr>
+      </w:r>
+      <w:r>
+        <w:rPr>
+          <w:rFonts w:ascii="Times New Roman"/>
+        </w:rPr>
       </w:r>
     </w:p>
     <w:p>

</xml_diff>

<commit_message>
Add DASFAA Steering Committee Member (2026 - Present)
Co-Authored-By: Claude Opus 5.5 <noreply@anthropic.com>
</commit_message>
<xml_diff>
--- a/resume/cv-full.docx
+++ b/resume/cv-full.docx
@@ -2783,6 +2783,26 @@
           <w:rFonts w:ascii="Times New Roman"/>
         </w:rPr>
         <w:t>2-2027</w:t>
+      </w:r>
+    </w:p>
+    <w:p>
+      <w:pPr>
+        <w:numPr>
+          <w:ilvl w:val="0"/>
+          <w:numId w:val="1"/>
+        </w:numPr>
+        <w:tabs>
+          <w:tab w:val="left" w:pos="1440"/>
+        </w:tabs>
+        <w:rPr>
+          <w:rFonts w:ascii="Times New Roman"/>
+        </w:rPr>
+      </w:pPr>
+      <w:r>
+        <w:rPr>
+          <w:rFonts w:ascii="Times New Roman"/>
+        </w:rPr>
+        <w:t>Steering Committee Member, The International Conference on Database Systems for Advanced Applications (DASFAA), 2026-Present</w:t>
       </w:r>
     </w:p>
     <w:p>

</xml_diff>

<commit_message>
Fix typos in cv-full (42nd, corresponding author, author-name punctuation, SIGMOD/NeurIPS casing, pp. spacing)
Co-Authored-By: Claude Opus 5.5 <noreply@anthropic.com>
</commit_message>
<xml_diff>
--- a/resume/cv-full.docx
+++ b/resume/cv-full.docx
@@ -2166,7 +2166,7 @@
         <w:rPr>
           <w:rFonts w:ascii="Times New Roman"/>
         </w:rPr>
-        <w:t>Sigmod 2026 Distinguished PC Member, 2026</w:t>
+        <w:t>SIGMOD 2026 Distinguished PC Member, 2026</w:t>
       </w:r>
     </w:p>
     <w:p>
@@ -2180,7 +2180,7 @@
         <w:rPr>
           <w:rFonts w:ascii="Times New Roman"/>
         </w:rPr>
-        <w:t xml:space="preserve">Neurips </w:t>
+        <w:t xml:space="preserve">NeurIPS </w:t>
       </w:r>
       <w:r>
         <w:rPr>
@@ -2364,7 +2364,7 @@
         <w:rPr>
           <w:rFonts w:ascii="Times New Roman" w:hint="eastAsia"/>
         </w:rPr>
-        <w:t>Sigmod 2021 Distinguished PC member, 2021</w:t>
+        <w:t>SIGMOD 2021 Distinguished PC member, 2021</w:t>
       </w:r>
     </w:p>
     <w:p>
@@ -10049,7 +10049,7 @@
         <w:rPr>
           <w:rFonts w:ascii="Times New Roman"/>
         </w:rPr>
-        <w:t>orresponding Author)</w:t>
+        <w:t>orresponding author)</w:t>
       </w:r>
     </w:p>
     <w:p>
@@ -10154,7 +10154,7 @@
         <w:rPr>
           <w:rFonts w:ascii="Times New Roman"/>
         </w:rPr>
-        <w:t>orresponding Author)</w:t>
+        <w:t>orresponding author)</w:t>
       </w:r>
     </w:p>
     <w:p>
@@ -10239,7 +10239,7 @@
         <w:rPr>
           <w:rFonts w:ascii="Times New Roman"/>
         </w:rPr>
-        <w:t>orresponding Author)</w:t>
+        <w:t>orresponding author)</w:t>
       </w:r>
     </w:p>
     <w:p>
@@ -10980,7 +10980,7 @@
         <w:rPr>
           <w:rFonts w:ascii="Times New Roman"/>
         </w:rPr>
-        <w:t xml:space="preserve">Vol. 2, Issue 3, Article No. 147, pp.1-27, </w:t>
+        <w:t xml:space="preserve">Vol. 2, Issue 3, Article No. 147, pp. 1-27, </w:t>
       </w:r>
       <w:r>
         <w:rPr>
@@ -11442,7 +11442,7 @@
         <w:rPr>
           <w:rFonts w:ascii="Times New Roman"/>
         </w:rPr>
-        <w:t xml:space="preserve">Park. Y., Tak, B., and </w:t>
+        <w:t xml:space="preserve">Park, Y., Tak, B., and </w:t>
       </w:r>
       <w:r>
         <w:rPr>
@@ -11474,7 +11474,7 @@
         <w:rPr>
           <w:rFonts w:ascii="Times New Roman"/>
         </w:rPr>
-        <w:t xml:space="preserve">Vol. 1, Issue 2, Article No. 134, pp.1-26, </w:t>
+        <w:t xml:space="preserve">Vol. 1, Issue 2, Article No. 134, pp. 1-26, </w:t>
       </w:r>
       <w:r>
         <w:rPr>
@@ -11563,7 +11563,7 @@
         <w:rPr>
           <w:rFonts w:ascii="Times New Roman"/>
         </w:rPr>
-        <w:t xml:space="preserve">pp.1-9, </w:t>
+        <w:t xml:space="preserve">pp. 1-9, </w:t>
       </w:r>
       <w:r>
         <w:rPr>
@@ -11800,7 +11800,7 @@
         <w:rPr>
           <w:rFonts w:ascii="Times New Roman"/>
         </w:rPr>
-        <w:t xml:space="preserve">pp.2381-2384, </w:t>
+        <w:t xml:space="preserve">pp. 2381-2384, </w:t>
       </w:r>
       <w:r>
         <w:rPr>
@@ -11916,7 +11916,7 @@
         <w:rPr>
           <w:rFonts w:ascii="Times New Roman"/>
         </w:rPr>
-        <w:t xml:space="preserve">IEEE ICDE, pp.872-884, </w:t>
+        <w:t xml:space="preserve">IEEE ICDE, pp. 872-884, </w:t>
       </w:r>
       <w:r>
         <w:rPr>
@@ -12062,7 +12062,7 @@
         <w:rPr>
           <w:rFonts w:ascii="Times New Roman"/>
         </w:rPr>
-        <w:t xml:space="preserve">Vol. 14, No. 11, pp.1979-1991, </w:t>
+        <w:t xml:space="preserve">Vol. 14, No. 11, pp. 1979-1991, </w:t>
       </w:r>
       <w:r>
         <w:rPr>
@@ -12120,7 +12120,7 @@
         <w:rPr>
           <w:rFonts w:ascii="Times New Roman"/>
         </w:rPr>
-        <w:t xml:space="preserve">pp.1298-1310, </w:t>
+        <w:t xml:space="preserve">pp. 1298-1310, </w:t>
       </w:r>
       <w:r>
         <w:rPr>
@@ -12214,7 +12214,7 @@
         <w:rPr>
           <w:rFonts w:ascii="Times New Roman"/>
         </w:rPr>
-        <w:t xml:space="preserve">pp.977-990, </w:t>
+        <w:t xml:space="preserve">pp. 977-990, </w:t>
       </w:r>
       <w:r>
         <w:rPr>
@@ -12290,7 +12290,7 @@
         <w:rPr>
           <w:rFonts w:ascii="Times New Roman"/>
         </w:rPr>
-        <w:t xml:space="preserve">pp.964-976, </w:t>
+        <w:t xml:space="preserve">pp. 964-976, </w:t>
       </w:r>
       <w:r>
         <w:rPr>
@@ -12366,7 +12366,7 @@
         <w:rPr>
           <w:rFonts w:ascii="Times New Roman"/>
         </w:rPr>
-        <w:t xml:space="preserve">pp.925-937, </w:t>
+        <w:t xml:space="preserve">pp. 925-937, </w:t>
       </w:r>
       <w:r>
         <w:rPr>
@@ -12478,7 +12478,7 @@
         <w:rPr>
           <w:rFonts w:ascii="Times New Roman"/>
         </w:rPr>
-        <w:t xml:space="preserve">pp.1368-1379, </w:t>
+        <w:t xml:space="preserve">pp. 1368-1379, </w:t>
       </w:r>
       <w:r>
         <w:rPr>
@@ -12572,7 +12572,7 @@
         <w:rPr>
           <w:rFonts w:ascii="Times New Roman"/>
         </w:rPr>
-        <w:t xml:space="preserve">pp.1845-1853, </w:t>
+        <w:t xml:space="preserve">pp. 1845-1853, </w:t>
       </w:r>
       <w:r>
         <w:rPr>
@@ -12643,7 +12643,7 @@
         <w:rPr>
           <w:rFonts w:ascii="Times New Roman"/>
         </w:rPr>
-        <w:t xml:space="preserve">pp.1737-1750, </w:t>
+        <w:t xml:space="preserve">pp. 1737-1750, </w:t>
       </w:r>
       <w:r>
         <w:rPr>
@@ -12713,7 +12713,7 @@
         <w:rPr>
           <w:rFonts w:ascii="Times New Roman"/>
         </w:rPr>
-        <w:t xml:space="preserve">pp.3019-3031, </w:t>
+        <w:t xml:space="preserve">pp. 3019-3031, </w:t>
       </w:r>
       <w:r>
         <w:rPr>
@@ -12783,7 +12783,7 @@
         <w:rPr>
           <w:rFonts w:ascii="Times New Roman"/>
         </w:rPr>
-        <w:t xml:space="preserve"> pp.3112-3124, </w:t>
+        <w:t xml:space="preserve"> pp. 3112-3124, </w:t>
       </w:r>
       <w:r>
         <w:rPr>
@@ -13088,7 +13088,7 @@
         <w:rPr>
           <w:rFonts w:ascii="Times New Roman"/>
         </w:rPr>
-        <w:t xml:space="preserve">, Vol. 12, No. 11, pp.1344-1356, May 2019. </w:t>
+        <w:t xml:space="preserve">, Vol. 12, No. 11, pp. 1344-1356, May 2019. </w:t>
       </w:r>
     </w:p>
     <w:p>
@@ -13224,7 +13224,7 @@
         <w:rPr>
           <w:rFonts w:ascii="Times New Roman"/>
         </w:rPr>
-        <w:t xml:space="preserve">pp.1966-1969, </w:t>
+        <w:t xml:space="preserve">pp. 1966-1969, </w:t>
       </w:r>
       <w:r>
         <w:rPr>
@@ -13774,7 +13774,7 @@
         <w:rPr>
           <w:rFonts w:ascii="Times New Roman"/>
         </w:rPr>
-        <w:t xml:space="preserve">, Lee, J., Ko, S., and Jarrah, M., “DualSim: Parallel Subgraph Enumeration in a Massive Graph on a Single Machine,” In Proc. 42th </w:t>
+        <w:t xml:space="preserve">, Lee, J., Ko, S., and Jarrah, M., “DualSim: Parallel Subgraph Enumeration in a Massive Graph on a Single Machine,” In Proc. 42nd </w:t>
       </w:r>
       <w:r>
         <w:rPr>
@@ -13856,7 +13856,7 @@
         <w:rPr>
           <w:rFonts w:ascii="Times New Roman"/>
         </w:rPr>
-        <w:t xml:space="preserve">, “Hybrid Garbage Collection for Multi-Version Concurrency Control in SAP HANA,” In Proc. 42th </w:t>
+        <w:t xml:space="preserve">, “Hybrid Garbage Collection for Multi-Version Concurrency Control in SAP HANA,” In Proc. 42nd </w:t>
       </w:r>
       <w:r>
         <w:rPr>
@@ -13875,7 +13875,7 @@
         <w:rPr>
           <w:rFonts w:ascii="Times New Roman"/>
         </w:rPr>
-        <w:t xml:space="preserve">pp.1307-1318, </w:t>
+        <w:t xml:space="preserve">pp. 1307-1318, </w:t>
       </w:r>
       <w:r>
         <w:rPr>
@@ -14549,7 +14549,7 @@
         <w:rPr>
           <w:rFonts w:ascii="Times New Roman"/>
         </w:rPr>
-        <w:t>pp.77-85, Aug.2013.</w:t>
+        <w:t>pp. 77-85, Aug. 2013.</w:t>
       </w:r>
       <w:r>
         <w:rPr>
@@ -17792,7 +17792,7 @@
         <w:rPr>
           <w:rFonts w:ascii="Times New Roman"/>
         </w:rPr>
-        <w:t xml:space="preserve">pp.1-24, April 2018 </w:t>
+        <w:t xml:space="preserve">pp. 1-24, April 2018 </w:t>
       </w:r>
       <w:r>
         <w:rPr>
@@ -19404,7 +19404,7 @@
         <w:rPr>
           <w:rFonts w:ascii="Times New Roman"/>
         </w:rPr>
-        <w:t xml:space="preserve">., and Kim. M., </w:t>
+        <w:t xml:space="preserve">., and Kim, M., </w:t>
       </w:r>
       <w:r>
         <w:rPr>
@@ -20905,7 +20905,7 @@
           <w:rFonts w:ascii="Times New Roman" w:eastAsia="함초롬바탕" w:hAnsi="Times New Roman" w:cs="Times New Roman"/>
           <w:shd w:val="clear" w:color="auto" w:fill="FFFFFF"/>
         </w:rPr>
-        <w:t>24, 2021 (minikeynote).</w:t>
+        <w:t>24, 2021 (mini-keynote).</w:t>
       </w:r>
     </w:p>
     <w:p>
@@ -23407,7 +23407,7 @@
         <w:rPr>
           <w:rFonts w:ascii="Times New Roman" w:hint="eastAsia"/>
         </w:rPr>
-        <w:t xml:space="preserve">SAP. </w:t>
+        <w:t xml:space="preserve">SAP, </w:t>
       </w:r>
       <w:r>
         <w:rPr>
@@ -23467,7 +23467,7 @@
         <w:rPr>
           <w:rFonts w:ascii="Times New Roman" w:hint="eastAsia"/>
         </w:rPr>
-        <w:t xml:space="preserve">SAP. </w:t>
+        <w:t xml:space="preserve">SAP, </w:t>
       </w:r>
       <w:r>
         <w:rPr>
@@ -23515,7 +23515,7 @@
         <w:rPr>
           <w:rFonts w:ascii="Times New Roman" w:hint="eastAsia"/>
         </w:rPr>
-        <w:t xml:space="preserve">SAP. </w:t>
+        <w:t xml:space="preserve">SAP, </w:t>
       </w:r>
       <w:r>
         <w:rPr>
@@ -23569,7 +23569,7 @@
         <w:rPr>
           <w:rFonts w:ascii="Times New Roman" w:hint="eastAsia"/>
         </w:rPr>
-        <w:t xml:space="preserve">SAP. </w:t>
+        <w:t xml:space="preserve">SAP, </w:t>
       </w:r>
       <w:r>
         <w:rPr>
@@ -26092,7 +26092,7 @@
         <w:rPr>
           <w:rFonts w:ascii="Times New Roman"/>
         </w:rPr>
-        <w:t xml:space="preserve">ark. S., and </w:t>
+        <w:t xml:space="preserve">ark, S., and </w:t>
       </w:r>
       <w:r>
         <w:rPr>
@@ -26344,7 +26344,7 @@
         <w:rPr>
           <w:rFonts w:ascii="Times New Roman"/>
         </w:rPr>
-        <w:t xml:space="preserve">ark. S., and </w:t>
+        <w:t xml:space="preserve">ark, S., and </w:t>
       </w:r>
       <w:r>
         <w:rPr>

</xml_diff>

<commit_message>
Add Retrieval Augmented Generation to research interests and Machine Learning to background
Co-Authored-By: Claude Opus 5.5 <noreply@anthropic.com>
</commit_message>
<xml_diff>
--- a/resume/cv-full.docx
+++ b/resume/cv-full.docx
@@ -15,7 +15,7 @@
         <w:rPr>
           <w:rFonts w:ascii="Times New Roman" w:hint="eastAsia"/>
         </w:rPr>
-        <w:t>October 27, 2026</w:t>
+        <w:t>October 28, 2026</w:t>
       </w:r>
     </w:p>
     <w:p>
@@ -1914,7 +1914,7 @@
         <w:rPr>
           <w:rFonts w:ascii="Times New Roman"/>
         </w:rPr>
-        <w:t xml:space="preserve">Query Processing and Optimization, </w:t>
+        <w:t xml:space="preserve">Query Processing and Optimization, Retrieval Augmented Generation, </w:t>
       </w:r>
       <w:r>
         <w:rPr>
@@ -2039,7 +2039,7 @@
         <w:rPr>
           <w:rFonts w:ascii="Times New Roman"/>
         </w:rPr>
-        <w:t>Databases, Data Mining, Ontology, Compilers, Operating Systems, Computer Architecture, Computer</w:t>
+        <w:t>Databases, Data Mining, Machine Learning, Ontology, Compilers, Operating Systems, Computer Architecture, Computer</w:t>
       </w:r>
       <w:r>
         <w:rPr>
@@ -2077,14 +2077,6 @@
           <w:sz w:val="24"/>
         </w:rPr>
       </w:pPr>
-      <w:r>
-        <w:rPr>
-          <w:rFonts w:ascii="Times New Roman"/>
-          <w:b/>
-          <w:sz w:val="24"/>
-        </w:rPr>
-        <w:br w:type="page"/>
-      </w:r>
       <w:r>
         <w:rPr>
           <w:rFonts w:ascii="Times New Roman" w:hint="eastAsia"/>

</xml_diff>